<commit_message>
Update documentation, deployed contract address, and finalized submission reports
</commit_message>
<xml_diff>
--- a/Aakarsh_Jha_230905248_BT_Assignment2.docx
+++ b/Aakarsh_Jha_230905248_BT_Assignment2.docx
@@ -8,22 +8,30 @@
       </w:pPr>
       <w:r>
         <w:rPr>
-          <w:rFonts w:ascii="Calibri" w:hAnsi="Calibri"/>
+          <w:rFonts w:ascii="Arial" w:hAnsi="Arial"/>
           <w:b/>
-          <w:color w:val="1E293B"/>
-          <w:sz w:val="40"/>
+          <w:color w:val="0F172A"/>
+          <w:sz w:val="26"/>
         </w:rPr>
-        <w:t>CSE4444 - Blockchain Technology</w:t>
+        <w:t>MANIPAL INSTITUTE OF TECHNOLOGY</w:t>
         <w:br/>
-        <w:t>Assignment 2 Submission Report</w:t>
+        <w:t>DEPARTMENT OF COMPUTER SCIENCE &amp; ENGINEERING</w:t>
+        <w:br/>
+      </w:r>
+      <w:r>
+        <w:rPr>
+          <w:rFonts w:ascii="Arial" w:hAnsi="Arial"/>
+          <w:color w:val="475569"/>
+          <w:sz w:val="22"/>
+        </w:rPr>
+        <w:t>CSE4444 - Blockchain Technology | Assignment 2 Submission Report</w:t>
+        <w:br/>
       </w:r>
     </w:p>
-    <w:p/>
     <w:tbl>
       <w:tblPr>
         <w:tblW w:type="auto" w:w="0"/>
         <w:jc w:val="center"/>
-        <w:tblLayout w:type="fixed"/>
         <w:tblLook w:firstColumn="1" w:firstRow="1" w:lastColumn="0" w:lastRow="0" w:noHBand="0" w:noVBand="1" w:val="04A0"/>
       </w:tblPr>
       <w:tblGrid>
@@ -33,14 +41,13 @@
       <w:tr>
         <w:tc>
           <w:tcPr>
-            <w:tcW w:type="dxa" w:w="3456"/>
-            <w:shd w:fill="F8FAFC"/>
+            <w:tcW w:type="dxa" w:w="3168"/>
           </w:tcPr>
           <w:p>
             <w:r>
               <w:rPr>
                 <w:b/>
-                <w:sz w:val="22"/>
+                <w:sz w:val="20"/>
               </w:rPr>
               <w:t>Student Name:</w:t>
             </w:r>
@@ -48,13 +55,12 @@
         </w:tc>
         <w:tc>
           <w:tcPr>
-            <w:tcW w:type="dxa" w:w="6480"/>
-            <w:shd w:fill="F8FAFC"/>
+            <w:tcW w:type="dxa" w:w="6768"/>
           </w:tcPr>
           <w:p>
             <w:r>
               <w:rPr>
-                <w:sz w:val="22"/>
+                <w:sz w:val="20"/>
               </w:rPr>
               <w:t>Aakarsh Jha</w:t>
             </w:r>
@@ -64,14 +70,13 @@
       <w:tr>
         <w:tc>
           <w:tcPr>
-            <w:tcW w:type="dxa" w:w="3456"/>
-            <w:shd w:fill="FFFFFF"/>
+            <w:tcW w:type="dxa" w:w="3168"/>
           </w:tcPr>
           <w:p>
             <w:r>
               <w:rPr>
                 <w:b/>
-                <w:sz w:val="22"/>
+                <w:sz w:val="20"/>
               </w:rPr>
               <w:t>Registration Number:</w:t>
             </w:r>
@@ -79,13 +84,12 @@
         </w:tc>
         <w:tc>
           <w:tcPr>
-            <w:tcW w:type="dxa" w:w="6480"/>
-            <w:shd w:fill="FFFFFF"/>
+            <w:tcW w:type="dxa" w:w="6768"/>
           </w:tcPr>
           <w:p>
             <w:r>
               <w:rPr>
-                <w:sz w:val="22"/>
+                <w:sz w:val="20"/>
               </w:rPr>
               <w:t>230905248</w:t>
             </w:r>
@@ -95,14 +99,13 @@
       <w:tr>
         <w:tc>
           <w:tcPr>
-            <w:tcW w:type="dxa" w:w="3456"/>
-            <w:shd w:fill="F8FAFC"/>
+            <w:tcW w:type="dxa" w:w="3168"/>
           </w:tcPr>
           <w:p>
             <w:r>
               <w:rPr>
                 <w:b/>
-                <w:sz w:val="22"/>
+                <w:sz w:val="20"/>
               </w:rPr>
               <w:t>Assignment Title:</w:t>
             </w:r>
@@ -110,13 +113,12 @@
         </w:tc>
         <w:tc>
           <w:tcPr>
-            <w:tcW w:type="dxa" w:w="6480"/>
-            <w:shd w:fill="F8FAFC"/>
+            <w:tcW w:type="dxa" w:w="6768"/>
           </w:tcPr>
           <w:p>
             <w:r>
               <w:rPr>
-                <w:sz w:val="22"/>
+                <w:sz w:val="20"/>
               </w:rPr>
               <w:t>Blockchain Technology (CSE4444) - Assignment 2</w:t>
             </w:r>
@@ -126,14 +128,13 @@
       <w:tr>
         <w:tc>
           <w:tcPr>
-            <w:tcW w:type="dxa" w:w="3456"/>
-            <w:shd w:fill="FFFFFF"/>
+            <w:tcW w:type="dxa" w:w="3168"/>
           </w:tcPr>
           <w:p>
             <w:r>
               <w:rPr>
                 <w:b/>
-                <w:sz w:val="22"/>
+                <w:sz w:val="20"/>
               </w:rPr>
               <w:t>Title of Developed DApp:</w:t>
             </w:r>
@@ -141,13 +142,12 @@
         </w:tc>
         <w:tc>
           <w:tcPr>
-            <w:tcW w:type="dxa" w:w="6480"/>
-            <w:shd w:fill="FFFFFF"/>
+            <w:tcW w:type="dxa" w:w="6768"/>
           </w:tcPr>
           <w:p>
             <w:r>
               <w:rPr>
-                <w:sz w:val="22"/>
+                <w:sz w:val="20"/>
               </w:rPr>
               <w:t>CertiTrust: Decentralized Academic Credential Verification System</w:t>
             </w:r>
@@ -157,14 +157,13 @@
       <w:tr>
         <w:tc>
           <w:tcPr>
-            <w:tcW w:type="dxa" w:w="3456"/>
-            <w:shd w:fill="F8FAFC"/>
+            <w:tcW w:type="dxa" w:w="3168"/>
           </w:tcPr>
           <w:p>
             <w:r>
               <w:rPr>
                 <w:b/>
-                <w:sz w:val="22"/>
+                <w:sz w:val="20"/>
               </w:rPr>
               <w:t>GitHub Repository Link:</w:t>
             </w:r>
@@ -172,14 +171,13 @@
         </w:tc>
         <w:tc>
           <w:tcPr>
-            <w:tcW w:type="dxa" w:w="6480"/>
-            <w:shd w:fill="F8FAFC"/>
+            <w:tcW w:type="dxa" w:w="6768"/>
           </w:tcPr>
           <w:p>
             <w:r>
               <w:rPr>
                 <w:color w:val="2563EB"/>
-                <w:sz w:val="22"/>
+                <w:sz w:val="20"/>
                 <w:u w:val="single"/>
               </w:rPr>
               <w:t>https://github.com/Aakarsh-Jha/Blockchain-Assignment-2</w:t>
@@ -197,12 +195,12 @@
         <w:rPr>
           <w:color w:val="1E293B"/>
         </w:rPr>
-        <w:t>1. DApp Overview &amp; Problem Statement</w:t>
+        <w:t>1. Problem Statement &amp; DApp Overview</w:t>
       </w:r>
     </w:p>
     <w:p>
       <w:r>
-        <w:t>CertiTrust is an original decentralized application (DApp) designed to address academic credential fraud. Academic certificates and degrees are cryptographically registered by an authorized institution on the Ethereum blockchain. Each certificate record contains the student's name, degree title, document reference hash, and an immutable block timestamp. Employers, verification agencies, and students can instantly query the blockchain to verify authenticity without relying on slow manual registrar confirmations.</w:t>
+        <w:t>Academic credential fraud and fabricated degrees pose severe integrity challenges to universities and employers. CertiTrust is an original Decentralized Application (DApp) architected on the Ethereum blockchain that establishes an immutable, publicly verifiable registry for academic qualifications. Authorized institutional authorities issue tamper-proof digital credentials linked to student identities and degree hashes. Third-party verifiers, recruiters, or regulatory bodies can instantaneously query the smart contract on-chain to authenticate credentials without administrative bottlenecks or single points of failure.</w:t>
       </w:r>
     </w:p>
     <w:p>
@@ -213,7 +211,7 @@
         <w:rPr>
           <w:color w:val="1E293B"/>
         </w:rPr>
-        <w:t>2. Technical Stack &amp; Architecture</w:t>
+        <w:t>2. Technical Stack &amp; Deployment Details</w:t>
       </w:r>
     </w:p>
     <w:tbl>
@@ -246,7 +244,7 @@
           </w:tcPr>
           <w:p>
             <w:r>
-              <w:t>Solidity (^0.8.20)</w:t>
+              <w:t>Solidity (^0.8.20, EVM Version: Paris)</w:t>
             </w:r>
           </w:p>
         </w:tc>
@@ -296,7 +294,7 @@
           </w:tcPr>
           <w:p>
             <w:r>
-              <w:t>Ganache Local / Remix VM / Sepolia Testnet</w:t>
+              <w:t>Ganache Local Network (Chain ID: 1337, RPC: http://127.0.0.1:8545)</w:t>
             </w:r>
           </w:p>
         </w:tc>
@@ -311,7 +309,7 @@
               <w:rPr>
                 <w:b/>
               </w:rPr>
-              <w:t>Contract Address:</w:t>
+              <w:t>Deployed Contract Address:</w:t>
             </w:r>
           </w:p>
         </w:tc>
@@ -321,7 +319,32 @@
           </w:tcPr>
           <w:p>
             <w:r>
-              <w:t>0x742d35Cc6634C0532925a3b844Bc454e4438f44e</w:t>
+              <w:t>0xCfEB869F69431e42cdB54A4F4f105C19C080A601</w:t>
+            </w:r>
+          </w:p>
+        </w:tc>
+      </w:tr>
+      <w:tr>
+        <w:tc>
+          <w:tcPr>
+            <w:tcW w:type="dxa" w:w="3600"/>
+          </w:tcPr>
+          <w:p>
+            <w:r>
+              <w:rPr>
+                <w:b/>
+              </w:rPr>
+              <w:t>Authority Owner Account:</w:t>
+            </w:r>
+          </w:p>
+        </w:tc>
+        <w:tc>
+          <w:tcPr>
+            <w:tcW w:type="dxa" w:w="6336"/>
+          </w:tcPr>
+          <w:p>
+            <w:r>
+              <w:t>0x90F8bf6A479f320ead074411a4B0e7944Ea8c9C1</w:t>
             </w:r>
           </w:p>
         </w:tc>
@@ -346,7 +369,7 @@
           </w:tcPr>
           <w:p>
             <w:r>
-              <w:t>HTML5, CSS3 (Modern Glassmorphic UI), JavaScript</w:t>
+              <w:t>HTML5, CSS3 (Modern Glassmorphic UI), JavaScript (Vanilla)</w:t>
             </w:r>
           </w:p>
         </w:tc>
@@ -396,7 +419,7 @@
           </w:tcPr>
           <w:p>
             <w:r>
-              <w:t>MetaMask Extension (Account &amp; Chain Event Listeners)</w:t>
+              <w:t>MetaMask Extension (Ganache Localhost RPC)</w:t>
             </w:r>
           </w:p>
         </w:tc>
@@ -411,12 +434,12 @@
         <w:rPr>
           <w:color w:val="1E293B"/>
         </w:rPr>
-        <w:t>3. Input Validation &amp; Test Scenario Verification</w:t>
+        <w:t>3. Input Validation &amp; Test Scenario Matrix</w:t>
       </w:r>
     </w:p>
     <w:p>
       <w:r>
-        <w:t>The smart contract implements comprehensive access control and validation using Solidity modifiers and require statements. The application was tested across three critical test vectors:</w:t>
+        <w:t>In strict compliance with the assignment specifications, the smart contract implements custom modifiers and require() statements to validate all operations. The system was tested across valid, invalid, and unauthorized inputs on the live blockchain:</w:t>
       </w:r>
     </w:p>
     <w:tbl>
@@ -529,7 +552,7 @@
               <w:rPr>
                 <w:sz w:val="19"/>
               </w:rPr>
-              <w:t>Valid student name, degree, and hash</w:t>
+              <w:t>Valid student name ('Aarav Sharma'), course, and hash</w:t>
             </w:r>
           </w:p>
         </w:tc>
@@ -542,7 +565,7 @@
               <w:rPr>
                 <w:sz w:val="19"/>
               </w:rPr>
-              <w:t>Transaction confirmed; new certificate ID emitted and stored on-chain.</w:t>
+              <w:t>Transaction mined successfully in Block #4; Certificate #1 created on-chain.</w:t>
             </w:r>
           </w:p>
         </w:tc>
@@ -596,7 +619,7 @@
               <w:rPr>
                 <w:sz w:val="19"/>
               </w:rPr>
-              <w:t>Transaction reverts with 'Validation Error: Student name cannot be empty.'</w:t>
+              <w:t>EVM reverted immediately with: 'Validation Error: Student name cannot be empty.' Zero state change.</w:t>
             </w:r>
           </w:p>
         </w:tc>
@@ -611,7 +634,7 @@
               <w:rPr>
                 <w:sz w:val="19"/>
               </w:rPr>
-              <w:t>TC-03 (Unauthorized Input)</w:t>
+              <w:t>TC-03 (Unauthorized Access)</w:t>
             </w:r>
           </w:p>
         </w:tc>
@@ -624,7 +647,7 @@
               <w:rPr>
                 <w:sz w:val="19"/>
               </w:rPr>
-              <w:t>Non-Owner (Account 2)</w:t>
+              <w:t>Non-Owner Account</w:t>
             </w:r>
           </w:p>
         </w:tc>
@@ -637,7 +660,7 @@
               <w:rPr>
                 <w:sz w:val="19"/>
               </w:rPr>
-              <w:t>Attempt to execute issueCertificate()</w:t>
+              <w:t>Attempted invocation of issueCertificate()</w:t>
             </w:r>
           </w:p>
         </w:tc>
@@ -650,7 +673,7 @@
               <w:rPr>
                 <w:sz w:val="19"/>
               </w:rPr>
-              <w:t>Transaction reverts with 'Error: Unauthorized! Only the university authority can perform this action.'</w:t>
+              <w:t>EVM reverted via onlyOwner modifier: 'Error: Unauthorized! Only the university authority can perform this action.'</w:t>
             </w:r>
           </w:p>
         </w:tc>
@@ -681,7 +704,7 @@
       <w:r>
         <w:drawing>
           <wp:inline xmlns:a="http://schemas.openxmlformats.org/drawingml/2006/main" xmlns:pic="http://schemas.openxmlformats.org/drawingml/2006/picture">
-            <wp:extent cx="5486400" cy="2606040"/>
+            <wp:extent cx="5486400" cy="2234208"/>
             <wp:docPr id="1" name="Picture 1"/>
             <wp:cNvGraphicFramePr>
               <a:graphicFrameLocks noChangeAspect="1"/>
@@ -702,7 +725,7 @@
                   <pic:spPr>
                     <a:xfrm>
                       <a:off x="0" y="0"/>
-                      <a:ext cx="5486400" cy="2606040"/>
+                      <a:ext cx="5486400" cy="2234208"/>
                     </a:xfrm>
                     <a:prstGeom prst="rect"/>
                   </pic:spPr>
@@ -720,14 +743,14 @@
           <w:b/>
           <w:sz w:val="20"/>
         </w:rPr>
-        <w:t>Figure 2: Smart Contract Deployment (Remix VM / Network)</w:t>
+        <w:t>Figure 2: Smart Contract Deployment (Ganache Network)</w:t>
       </w:r>
     </w:p>
     <w:p>
       <w:r>
         <w:drawing>
           <wp:inline xmlns:a="http://schemas.openxmlformats.org/drawingml/2006/main" xmlns:pic="http://schemas.openxmlformats.org/drawingml/2006/picture">
-            <wp:extent cx="5486400" cy="2606040"/>
+            <wp:extent cx="5486400" cy="2394942"/>
             <wp:docPr id="2" name="Picture 2"/>
             <wp:cNvGraphicFramePr>
               <a:graphicFrameLocks noChangeAspect="1"/>
@@ -748,7 +771,7 @@
                   <pic:spPr>
                     <a:xfrm>
                       <a:off x="0" y="0"/>
-                      <a:ext cx="5486400" cy="2606040"/>
+                      <a:ext cx="5486400" cy="2394942"/>
                     </a:xfrm>
                     <a:prstGeom prst="rect"/>
                   </pic:spPr>
@@ -773,7 +796,7 @@
       <w:r>
         <w:drawing>
           <wp:inline xmlns:a="http://schemas.openxmlformats.org/drawingml/2006/main" xmlns:pic="http://schemas.openxmlformats.org/drawingml/2006/picture">
-            <wp:extent cx="5486400" cy="2606040"/>
+            <wp:extent cx="5486400" cy="2743200"/>
             <wp:docPr id="3" name="Picture 3"/>
             <wp:cNvGraphicFramePr>
               <a:graphicFrameLocks noChangeAspect="1"/>
@@ -794,7 +817,7 @@
                   <pic:spPr>
                     <a:xfrm>
                       <a:off x="0" y="0"/>
-                      <a:ext cx="5486400" cy="2606040"/>
+                      <a:ext cx="5486400" cy="2743200"/>
                     </a:xfrm>
                     <a:prstGeom prst="rect"/>
                   </pic:spPr>
@@ -812,14 +835,14 @@
           <w:b/>
           <w:sz w:val="20"/>
         </w:rPr>
-        <w:t>Figure 4: Successful Transaction Execution &amp; Mining</w:t>
+        <w:t>Figure 4: Successful Transaction Execution &amp; Mining (Block #4)</w:t>
       </w:r>
     </w:p>
     <w:p>
       <w:r>
         <w:drawing>
           <wp:inline xmlns:a="http://schemas.openxmlformats.org/drawingml/2006/main" xmlns:pic="http://schemas.openxmlformats.org/drawingml/2006/picture">
-            <wp:extent cx="5486400" cy="2606040"/>
+            <wp:extent cx="5486400" cy="2780705"/>
             <wp:docPr id="4" name="Picture 4"/>
             <wp:cNvGraphicFramePr>
               <a:graphicFrameLocks noChangeAspect="1"/>
@@ -840,7 +863,7 @@
                   <pic:spPr>
                     <a:xfrm>
                       <a:off x="0" y="0"/>
-                      <a:ext cx="5486400" cy="2606040"/>
+                      <a:ext cx="5486400" cy="2780705"/>
                     </a:xfrm>
                     <a:prstGeom prst="rect"/>
                   </pic:spPr>
@@ -865,7 +888,7 @@
       <w:r>
         <w:drawing>
           <wp:inline xmlns:a="http://schemas.openxmlformats.org/drawingml/2006/main" xmlns:pic="http://schemas.openxmlformats.org/drawingml/2006/picture">
-            <wp:extent cx="5486400" cy="2606040"/>
+            <wp:extent cx="5486400" cy="2748558"/>
             <wp:docPr id="5" name="Picture 5"/>
             <wp:cNvGraphicFramePr>
               <a:graphicFrameLocks noChangeAspect="1"/>
@@ -886,7 +909,7 @@
                   <pic:spPr>
                     <a:xfrm>
                       <a:off x="0" y="0"/>
-                      <a:ext cx="5486400" cy="2606040"/>
+                      <a:ext cx="5486400" cy="2748558"/>
                     </a:xfrm>
                     <a:prstGeom prst="rect"/>
                   </pic:spPr>
@@ -911,7 +934,7 @@
       <w:r>
         <w:drawing>
           <wp:inline xmlns:a="http://schemas.openxmlformats.org/drawingml/2006/main" xmlns:pic="http://schemas.openxmlformats.org/drawingml/2006/picture">
-            <wp:extent cx="5486400" cy="2606040"/>
+            <wp:extent cx="5486400" cy="2737842"/>
             <wp:docPr id="6" name="Picture 6"/>
             <wp:cNvGraphicFramePr>
               <a:graphicFrameLocks noChangeAspect="1"/>
@@ -932,7 +955,7 @@
                   <pic:spPr>
                     <a:xfrm>
                       <a:off x="0" y="0"/>
-                      <a:ext cx="5486400" cy="2606040"/>
+                      <a:ext cx="5486400" cy="2737842"/>
                     </a:xfrm>
                     <a:prstGeom prst="rect"/>
                   </pic:spPr>

</xml_diff>